<commit_message>
fix word template formatting
</commit_message>
<xml_diff>
--- a/SzakdolgozatErtekeloApi/Doksik/Biralat.docx
+++ b/SzakdolgozatErtekeloApi/Doksik/Biralat.docx
@@ -223,7 +223,7 @@
             <w:rPr>
               <w:rStyle w:val="Helyrzszveg"/>
             </w:rPr>
-            <w:t>sadads</w:t>
+            <w:t>string</w:t>
           </w:r>
         </w:sdtContent>
       </w:sdt>
@@ -295,7 +295,7 @@
             <w:rPr>
               <w:rStyle w:val="Helyrzszveg"/>
             </w:rPr>
-            <w:t>sadasd</w:t>
+            <w:t>string</w:t>
           </w:r>
         </w:sdtContent>
       </w:sdt>
@@ -340,7 +340,7 @@
             <w:rPr>
               <w:rStyle w:val="Helyrzszveg"/>
             </w:rPr>
-            <w:t>Programtervező_informatikus</w:t>
+            <w:t>Programtervező informatikus</w:t>
           </w:r>
         </w:sdtContent>
       </w:sdt>
@@ -385,7 +385,7 @@
             <w:rPr>
               <w:rStyle w:val="Helyrzszveg"/>
             </w:rPr>
-            <w:t>asdasd</w:t>
+            <w:t>string</w:t>
           </w:r>
         </w:sdtContent>
       </w:sdt>
@@ -397,11 +397,11 @@
         <w:tblLook w:val="04A0" w:firstRow="1" w:lastRow="0" w:firstColumn="1" w:lastColumn="0" w:noHBand="0" w:noVBand="1"/>
       </w:tblPr>
       <w:tblGrid>
-        <w:gridCol w:w="1794"/>
-        <w:gridCol w:w="1818"/>
-        <w:gridCol w:w="1634"/>
-        <w:gridCol w:w="1177"/>
-        <w:gridCol w:w="1431"/>
+        <w:gridCol w:w="1778"/>
+        <w:gridCol w:w="1803"/>
+        <w:gridCol w:w="1624"/>
+        <w:gridCol w:w="1221"/>
+        <w:gridCol w:w="1428"/>
         <w:gridCol w:w="1221"/>
       </w:tblGrid>
       <w:tr>
@@ -656,9 +656,6 @@
                 <w:r>
                   <w:rPr>
                     <w:rStyle w:val="Helyrzszveg"/>
-                    <w:rFonts w:ascii="Times New Roman" w:hAnsi="Times New Roman" w:cs="Times New Roman"/>
-                    <w:sz w:val="18"/>
-                    <w:szCs w:val="18"/>
                   </w:rPr>
                   <w:t>1. A szakdolgozat szerkezeti felépítése, tartalmi tagolása, alaki megjelenése.</w:t>
                 </w:r>
@@ -695,9 +692,6 @@
                 <w:r>
                   <w:rPr>
                     <w:rStyle w:val="Helyrzszveg"/>
-                    <w:rFonts w:ascii="Times New Roman" w:hAnsi="Times New Roman" w:cs="Times New Roman"/>
-                    <w:sz w:val="18"/>
-                    <w:szCs w:val="18"/>
                   </w:rPr>
                   <w:t>A dolgozat nem felel meg az EKKE szakdolgozati követelményeinek.</w:t>
                 </w:r>
@@ -734,9 +728,6 @@
                 <w:r>
                   <w:rPr>
                     <w:rStyle w:val="Helyrzszveg"/>
-                    <w:rFonts w:ascii="Times New Roman" w:hAnsi="Times New Roman" w:cs="Times New Roman"/>
-                    <w:sz w:val="18"/>
-                    <w:szCs w:val="18"/>
                   </w:rPr>
                   <w:t>A követelmények-nek lényegében megfelel, de nagyobb hiányosságokkal.</w:t>
                 </w:r>
@@ -773,9 +764,6 @@
                 <w:r>
                   <w:rPr>
                     <w:rStyle w:val="Helyrzszveg"/>
-                    <w:rFonts w:ascii="Times New Roman" w:hAnsi="Times New Roman" w:cs="Times New Roman"/>
-                    <w:sz w:val="18"/>
-                    <w:szCs w:val="18"/>
                   </w:rPr>
                   <w:t>A követelmé-nyeknek lényegében megfelel, kisebb hiányosságokkal.</w:t>
                 </w:r>
@@ -812,9 +800,6 @@
                 <w:r>
                   <w:rPr>
                     <w:rStyle w:val="Helyrzszveg"/>
-                    <w:rFonts w:ascii="Times New Roman" w:hAnsi="Times New Roman" w:cs="Times New Roman"/>
-                    <w:sz w:val="18"/>
-                    <w:szCs w:val="18"/>
                   </w:rPr>
                   <w:t>Kifogástalan szerkezet, tartalmi tagolás, szép kivitel.</w:t>
                 </w:r>
@@ -845,11 +830,13 @@
                   <w:bottom w:val="single" w:color="000000" w:sz="4" w:space="0"/>
                   <w:right w:val="single" w:color="000000" w:sz="4" w:space="0"/>
                 </w:tcBorders>
+                <w:vAlign w:val="center"/>
               </w:tcPr>
               <w:p>
                 <w:pPr>
                   <w:widowControl w:val="0"/>
                   <w:spacing w:after="0" w:line="240" w:lineRule="auto"/>
+                  <w:jc w:val="center"/>
                   <w:rPr>
                     <w:rFonts w:ascii="Times New Roman" w:hAnsi="Times New Roman" w:cs="Times New Roman"/>
                   </w:rPr>
@@ -858,7 +845,7 @@
                   <w:rPr>
                     <w:rStyle w:val="Helyrzszveg"/>
                   </w:rPr>
-                  <w:t>1</w:t>
+                  <w:t>0</w:t>
                 </w:r>
               </w:p>
             </w:tc>
@@ -903,7 +890,7 @@
             <w:rPr>
               <w:rStyle w:val="Helyrzszveg"/>
             </w:rPr>
-            <w:t/>
+            <w:t>string</w:t>
           </w:r>
         </w:sdtContent>
       </w:sdt>
@@ -1199,7 +1186,7 @@
                     <w:sz w:val="18"/>
                     <w:szCs w:val="18"/>
                   </w:rPr>
-                  <w:t>2. A szakdolgozat nyelvezete, stílusa, nyelvi helyessége.</w:t>
+                  <w:t>Szöveg beírásához kattintson vagy koppintson ide.</w:t>
                 </w:r>
               </w:p>
             </w:tc>
@@ -1237,7 +1224,7 @@
                     <w:sz w:val="18"/>
                     <w:szCs w:val="18"/>
                   </w:rPr>
-                  <w:t>Nyelvezete mondatszerkesztése erősen kifogásolható, durva helyesírási hibákat tartalmaz.</w:t>
+                  <w:t>Szöveg beírásához kattintson vagy koppintson ide.</w:t>
                 </w:r>
               </w:p>
             </w:tc>
@@ -1275,7 +1262,7 @@
                     <w:sz w:val="18"/>
                     <w:szCs w:val="18"/>
                   </w:rPr>
-                  <w:t>Nyelvezet, stílusa sok hiányossággal, kisebb helyesírási hibákat tartalmaz.</w:t>
+                  <w:t>Szöveg beírásához kattintson vagy koppintson ide.</w:t>
                 </w:r>
               </w:p>
             </w:tc>
@@ -1313,7 +1300,7 @@
                     <w:sz w:val="18"/>
                     <w:szCs w:val="18"/>
                   </w:rPr>
-                  <w:t>Nyelvezete megfelelő, kevés stílushibával.</w:t>
+                  <w:t>Szöveg beírásához kattintson vagy koppintson ide.</w:t>
                 </w:r>
               </w:p>
             </w:tc>
@@ -1351,7 +1338,7 @@
                     <w:sz w:val="18"/>
                     <w:szCs w:val="18"/>
                   </w:rPr>
-                  <w:t>Kifogástalan nyelvezet és stílus.</w:t>
+                  <w:t>Szöveg beírásához kattintson vagy koppintson ide.</w:t>
                 </w:r>
               </w:p>
             </w:tc>
@@ -1380,11 +1367,13 @@
                   <w:bottom w:val="single" w:color="000000" w:sz="4" w:space="0"/>
                   <w:right w:val="single" w:color="000000" w:sz="4" w:space="0"/>
                 </w:tcBorders>
+                <w:vAlign w:val="center"/>
               </w:tcPr>
               <w:p>
                 <w:pPr>
                   <w:widowControl w:val="0"/>
                   <w:spacing w:after="0" w:line="240" w:lineRule="auto"/>
+                  <w:jc w:val="center"/>
                   <w:rPr>
                     <w:rFonts w:asciiTheme="minorHAnsi" w:hAnsiTheme="minorHAnsi" w:cstheme="minorHAnsi"/>
                   </w:rPr>
@@ -1393,7 +1382,7 @@
                   <w:rPr>
                     <w:rStyle w:val="Helyrzszveg"/>
                   </w:rPr>
-                  <w:t>0</w:t>
+                  <w:t>Szöveg beírásához kattintson vagy koppintson ide.</w:t>
                 </w:r>
               </w:p>
             </w:tc>
@@ -1438,7 +1427,7 @@
             <w:rPr>
               <w:rStyle w:val="Helyrzszveg"/>
             </w:rPr>
-            <w:t/>
+            <w:t>Szöveg beírásához kattintson vagy koppintson ide.</w:t>
           </w:r>
         </w:sdtContent>
       </w:sdt>
@@ -1449,6 +1438,21 @@
           <w:rFonts w:ascii="Times New Roman" w:hAnsi="Times New Roman" w:cs="Times New Roman"/>
         </w:rPr>
       </w:pPr>
+    </w:p>
+    <w:p>
+      <w:pPr>
+        <w:suppressAutoHyphens w:val="0"/>
+        <w:spacing w:after="160" w:line="259" w:lineRule="auto"/>
+        <w:rPr>
+          <w:rFonts w:ascii="Times New Roman" w:hAnsi="Times New Roman" w:cs="Times New Roman"/>
+        </w:rPr>
+      </w:pPr>
+      <w:r>
+        <w:rPr>
+          <w:rFonts w:ascii="Times New Roman" w:hAnsi="Times New Roman" w:cs="Times New Roman"/>
+        </w:rPr>
+        <w:br w:type="page"/>
+      </w:r>
     </w:p>
     <w:p>
       <w:pPr>
@@ -1726,7 +1730,7 @@
                     <w:sz w:val="18"/>
                     <w:szCs w:val="18"/>
                   </w:rPr>
-                  <w:t>3. A dolgozat szakirodalmi hátterének feltárása, szakszerűsége, a hivatkozások helyessége.</w:t>
+                  <w:t>Szöveg beírásához kattintson vagy koppintson ide.</w:t>
                 </w:r>
               </w:p>
             </w:tc>
@@ -1777,7 +1781,7 @@
                     <w:sz w:val="18"/>
                     <w:szCs w:val="18"/>
                   </w:rPr>
-                  <w:t>A szakirodalom nem releváns. A hivatkozások hiányoznak, vagy nem szakszerűek. </w:t>
+                  <w:t>Szöveg beírásához kattintson vagy koppintson ide.</w:t>
                 </w:r>
               </w:sdtContent>
             </w:sdt>
@@ -1815,7 +1819,7 @@
                     <w:sz w:val="18"/>
                     <w:szCs w:val="18"/>
                   </w:rPr>
-                  <w:t>A szakirodalom feltárása szűk körű, csak tankönyvek, vagy jegyzetek anyagát tartalmazza. Hivatkozásai több helyen pontatlanok.</w:t>
+                  <w:t>Szöveg beírásához kattintson vagy koppintson ide.</w:t>
                 </w:r>
               </w:p>
             </w:tc>
@@ -1853,7 +1857,7 @@
                     <w:sz w:val="18"/>
                     <w:szCs w:val="18"/>
                   </w:rPr>
-                  <w:t>Legfontosabb szakirodalmakat, korrekt hivatkozásokat tartalmaz a dolgozat. Az elmélet koherens, egységet alkot. </w:t>
+                  <w:t>Szöveg beírásához kattintson vagy koppintson ide.</w:t>
                 </w:r>
               </w:p>
             </w:tc>
@@ -1897,16 +1901,7 @@
                     <w:sz w:val="18"/>
                     <w:szCs w:val="18"/>
                   </w:rPr>
-                  <w:t xml:space="preserve">Legújabb széles körű szakirodalom alapján íródott a dolgozat. Hivatkozások pontosak.</w:t>
-                </w:r>
-                <w:r>
-                  <w:rPr>
-                    <w:rStyle w:val="Helyrzszveg"/>
-                    <w:sz w:val="18"/>
-                    <w:szCs w:val="18"/>
-                  </w:rPr>
-                  <w:lastRenderedPageBreak/>
-                  <w:t>ide.</w:t>
+                  <w:t>Szöveg beírásához kattintson vagy koppintson ide.</w:t>
                 </w:r>
               </w:p>
             </w:tc>
@@ -1935,11 +1930,13 @@
                   <w:bottom w:val="single" w:color="000000" w:sz="4" w:space="0"/>
                   <w:right w:val="single" w:color="000000" w:sz="4" w:space="0"/>
                 </w:tcBorders>
+                <w:vAlign w:val="center"/>
               </w:tcPr>
               <w:p>
                 <w:pPr>
                   <w:widowControl w:val="0"/>
                   <w:spacing w:after="0" w:line="240" w:lineRule="auto"/>
+                  <w:jc w:val="center"/>
                   <w:rPr>
                     <w:rFonts w:asciiTheme="minorHAnsi" w:hAnsiTheme="minorHAnsi" w:cstheme="minorHAnsi"/>
                   </w:rPr>
@@ -1948,14 +1945,7 @@
                   <w:rPr>
                     <w:rStyle w:val="Helyrzszveg"/>
                   </w:rPr>
-                  <w:t xml:space="preserve">0</w:t>
-                </w:r>
-                <w:r>
-                  <w:rPr>
-                    <w:rStyle w:val="Helyrzszveg"/>
-                  </w:rPr>
-                  <w:lastRenderedPageBreak/>
-                  <w:t>vagy koppintson ide.</w:t>
+                  <w:t>Szöveg beírásához kattintson vagy koppintson ide.</w:t>
                 </w:r>
               </w:p>
             </w:tc>
@@ -1970,7 +1960,6 @@
           <w:sz w:val="18"/>
           <w:szCs w:val="18"/>
         </w:rPr>
-        <w:lastRenderedPageBreak/>
         <w:t>Rövid indoklás (opcionális):</w:t>
       </w:r>
       <w:r>
@@ -2001,7 +1990,7 @@
             <w:rPr>
               <w:rStyle w:val="Helyrzszveg"/>
             </w:rPr>
-            <w:t/>
+            <w:t>Szöveg beírásához kattintson vagy koppintson ide.</w:t>
           </w:r>
         </w:sdtContent>
       </w:sdt>
@@ -2289,7 +2278,7 @@
                     <w:sz w:val="18"/>
                     <w:szCs w:val="18"/>
                   </w:rPr>
-                  <w:t>4. A megvalósított feladat (program) nehézsége, összetettsége.</w:t>
+                  <w:t>Szöveg beírásához kattintson vagy koppintson ide.</w:t>
                 </w:r>
               </w:p>
             </w:tc>
@@ -2328,7 +2317,7 @@
                     <w:sz w:val="18"/>
                     <w:szCs w:val="18"/>
                   </w:rPr>
-                  <w:t>A megvalósított feladat nem teljesíti a szakdolgozattól elvárt nehézségi szintet.</w:t>
+                  <w:t>Szöveg beírásához kattintson vagy koppintson ide.</w:t>
                 </w:r>
               </w:p>
             </w:tc>
@@ -2367,7 +2356,7 @@
                     <w:sz w:val="18"/>
                     <w:szCs w:val="18"/>
                   </w:rPr>
-                  <w:t>A megvalósított feladat éppen teljesíti a szakdolgozattól elvárt nehézségi szintet. </w:t>
+                  <w:t>Szöveg beírásához kattintson vagy koppintson ide.</w:t>
                 </w:r>
               </w:p>
             </w:tc>
@@ -2406,7 +2395,7 @@
                     <w:sz w:val="18"/>
                     <w:szCs w:val="18"/>
                   </w:rPr>
-                  <w:t>A megvalósított feladat teljesíti a szakdolgozattól elvárt nehézségi szintet.</w:t>
+                  <w:t>Szöveg beírásához kattintson vagy koppintson ide.</w:t>
                 </w:r>
               </w:p>
             </w:tc>
@@ -2444,7 +2433,7 @@
                     <w:sz w:val="18"/>
                     <w:szCs w:val="18"/>
                   </w:rPr>
-                  <w:t>A megvalósított feladat túlmutat a szakdolgozattól elvárt nehézségi szinten.</w:t>
+                  <w:t>Szöveg beírásához kattintson vagy koppintson ide.</w:t>
                 </w:r>
               </w:p>
             </w:tc>
@@ -2473,11 +2462,13 @@
                   <w:bottom w:val="single" w:color="000000" w:sz="4" w:space="0"/>
                   <w:right w:val="single" w:color="000000" w:sz="4" w:space="0"/>
                 </w:tcBorders>
+                <w:vAlign w:val="center"/>
               </w:tcPr>
               <w:p>
                 <w:pPr>
                   <w:widowControl w:val="0"/>
                   <w:spacing w:after="0" w:line="240" w:lineRule="auto"/>
+                  <w:jc w:val="center"/>
                   <w:rPr>
                     <w:rFonts w:asciiTheme="minorHAnsi" w:hAnsiTheme="minorHAnsi" w:cstheme="minorHAnsi"/>
                   </w:rPr>
@@ -2486,7 +2477,7 @@
                   <w:rPr>
                     <w:rStyle w:val="Helyrzszveg"/>
                   </w:rPr>
-                  <w:t>0</w:t>
+                  <w:t>Szöveg beírásához kattintson vagy koppintson ide.</w:t>
                 </w:r>
               </w:p>
             </w:tc>
@@ -2531,7 +2522,7 @@
             <w:rPr>
               <w:rStyle w:val="Helyrzszveg"/>
             </w:rPr>
-            <w:t/>
+            <w:t>Szöveg beírásához kattintson vagy koppintson ide.</w:t>
           </w:r>
         </w:sdtContent>
       </w:sdt>
@@ -2831,7 +2822,7 @@
                     <w:sz w:val="18"/>
                     <w:szCs w:val="18"/>
                   </w:rPr>
-                  <w:t>5. Megvalósítás minősége I.A feladat ismertetése, a célkitűzés definiálása (specifikáció, megvalósítási terv, összefüggések elemzése).</w:t>
+                  <w:t>Szöveg beírásához kattintson vagy koppintson ide.</w:t>
                 </w:r>
               </w:p>
             </w:tc>
@@ -2869,7 +2860,7 @@
                     <w:sz w:val="18"/>
                     <w:szCs w:val="18"/>
                   </w:rPr>
-                  <w:t>A dolgozatból a feladat ismertetése, illetve a célkitűzés definiálása teljes mértékben hiányzik.</w:t>
+                  <w:t>Szöveg beírásához kattintson vagy koppintson ide.</w:t>
                 </w:r>
               </w:p>
             </w:tc>
@@ -2907,7 +2898,7 @@
                     <w:sz w:val="18"/>
                     <w:szCs w:val="18"/>
                   </w:rPr>
-                  <w:t>A dolgozatban megjelenik a feladat ismertetése, továbbá a célkitűzés definiálása, de a leírás alapszintű, elnagyolt, hiányos.</w:t>
+                  <w:t>Szöveg beírásához kattintson vagy koppintson ide.</w:t>
                 </w:r>
               </w:p>
             </w:tc>
@@ -2945,7 +2936,7 @@
                     <w:sz w:val="18"/>
                     <w:szCs w:val="18"/>
                   </w:rPr>
-                  <w:t>A dolgozatban a feladat ismertetése, illetve a célkitűzés definiálása formailag megfelelő, egy alapszintű leíráson túlmutat, szakmailag megfelelő, de nem teljes és ellentmondásmentes.</w:t>
+                  <w:t>Szöveg beírásához kattintson vagy koppintson ide.</w:t>
                 </w:r>
               </w:p>
             </w:tc>
@@ -2983,7 +2974,7 @@
                     <w:sz w:val="18"/>
                     <w:szCs w:val="18"/>
                   </w:rPr>
-                  <w:t>A dolgozatban  a feladat ismertetése, illetve a célkitűzések definiálása szakmailag korrekt, formailag megfelelő, teljes és ellentmondásmentes.</w:t>
+                  <w:t>Szöveg beírásához kattintson vagy koppintson ide.</w:t>
                 </w:r>
               </w:p>
             </w:tc>
@@ -3014,11 +3005,13 @@
                   <w:bottom w:val="single" w:color="000000" w:sz="4" w:space="0"/>
                   <w:right w:val="single" w:color="000000" w:sz="4" w:space="0"/>
                 </w:tcBorders>
+                <w:vAlign w:val="center"/>
               </w:tcPr>
               <w:p>
                 <w:pPr>
                   <w:widowControl w:val="0"/>
                   <w:spacing w:after="0" w:line="240" w:lineRule="auto"/>
+                  <w:jc w:val="center"/>
                   <w:rPr>
                     <w:rFonts w:ascii="Times New Roman" w:hAnsi="Times New Roman" w:cs="Times New Roman"/>
                     <w:sz w:val="18"/>
@@ -3029,7 +3022,7 @@
                   <w:rPr>
                     <w:rStyle w:val="Helyrzszveg"/>
                   </w:rPr>
-                  <w:t>0</w:t>
+                  <w:t>Szöveg beírásához kattintson vagy koppintson ide.</w:t>
                 </w:r>
               </w:p>
             </w:tc>
@@ -3074,7 +3067,7 @@
             <w:rPr>
               <w:rStyle w:val="Helyrzszveg"/>
             </w:rPr>
-            <w:t/>
+            <w:t>Szöveg beírásához kattintson vagy koppintson ide.</w:t>
           </w:r>
         </w:sdtContent>
       </w:sdt>
@@ -3364,7 +3357,7 @@
                     <w:sz w:val="18"/>
                     <w:szCs w:val="18"/>
                   </w:rPr>
-                  <w:t>6. Megvalósítás minősége II.Kódminőség.</w:t>
+                  <w:t>Szöveg beírásához kattintson vagy koppintson ide.</w:t>
                 </w:r>
               </w:p>
             </w:tc>
@@ -3404,7 +3397,7 @@
                     <w:sz w:val="18"/>
                     <w:szCs w:val="18"/>
                   </w:rPr>
-                  <w:t>A forráskód tartalma, mennyisége, szerkezete nem megfelelő.</w:t>
+                  <w:t>Szöveg beírásához kattintson vagy koppintson ide.</w:t>
                 </w:r>
               </w:p>
             </w:tc>
@@ -3444,7 +3437,7 @@
                     <w:sz w:val="18"/>
                     <w:szCs w:val="18"/>
                   </w:rPr>
-                  <w:t>A forráskód tartalma, mennyisége, szerkezete megfelelő, de nehézen áttekinthető, terjengős, strukturálatlan, és helyenként indokolatlan nyelvi elemeket tartalmaz.Nem tartalmazza a szükséges ellenőrzési, hibakezelési funkciókat.</w:t>
+                  <w:t>Szöveg beírásához kattintson vagy koppintson ide.</w:t>
                 </w:r>
               </w:p>
             </w:tc>
@@ -3484,7 +3477,7 @@
                     <w:sz w:val="18"/>
                     <w:szCs w:val="18"/>
                   </w:rPr>
-                  <w:t>A forráskód tartalma, mennyisége, összetettsége jó. A forráskódban megjelennek a korszerű, hatékony nyelvi elemek. Jól strukturált, áttekinthető, tartalmazza a szükséges ellenőrzési, hibakezelési funkciókat.</w:t>
+                  <w:t>Szöveg beírásához kattintson vagy koppintson ide.</w:t>
                 </w:r>
               </w:p>
             </w:tc>
@@ -3524,7 +3517,7 @@
                     <w:sz w:val="18"/>
                     <w:szCs w:val="18"/>
                   </w:rPr>
-                  <w:t>A forráskód tartalma, mennyisége, összetettsége kiváló. Korszerű, hatékony nyelvi elemeket tartalmaz. Jól strukturált, áttekinthető, öndokumentáló, újrafelhasználható. Megvalósított a teljeskörű hiba- és kivételkezelés. Erőforrás-ütemezés szempontjából optimalizált.</w:t>
+                  <w:t>Szöveg beírásához kattintson vagy koppintson ide.</w:t>
                 </w:r>
               </w:p>
             </w:tc>
@@ -3553,11 +3546,13 @@
                   <w:bottom w:val="single" w:color="000000" w:sz="4" w:space="0"/>
                   <w:right w:val="single" w:color="000000" w:sz="4" w:space="0"/>
                 </w:tcBorders>
+                <w:vAlign w:val="center"/>
               </w:tcPr>
               <w:p>
                 <w:pPr>
                   <w:widowControl w:val="0"/>
                   <w:spacing w:after="0" w:line="240" w:lineRule="auto"/>
+                  <w:jc w:val="center"/>
                   <w:rPr>
                     <w:rFonts w:ascii="Times New Roman" w:hAnsi="Times New Roman" w:cs="Times New Roman"/>
                   </w:rPr>
@@ -3566,7 +3561,7 @@
                   <w:rPr>
                     <w:rStyle w:val="Helyrzszveg"/>
                   </w:rPr>
-                  <w:t>0</w:t>
+                  <w:t>Szöveg beírásához kattintson vagy koppintson ide.</w:t>
                 </w:r>
               </w:p>
             </w:tc>
@@ -3611,7 +3606,7 @@
             <w:rPr>
               <w:rStyle w:val="Helyrzszveg"/>
             </w:rPr>
-            <w:t/>
+            <w:t>Szöveg beírásához kattintson vagy koppintson ide.</w:t>
           </w:r>
         </w:sdtContent>
       </w:sdt>
@@ -3901,16 +3896,7 @@
                     <w:sz w:val="18"/>
                     <w:szCs w:val="18"/>
                   </w:rPr>
-                  <w:t xml:space="preserve">7. Megvalósítás minősége III.Fejlesztési- és felhasználói dokumentáció.</w:t>
-                </w:r>
-                <w:r>
-                  <w:rPr>
-                    <w:rStyle w:val="Helyrzszveg"/>
-                    <w:sz w:val="18"/>
-                    <w:szCs w:val="18"/>
-                  </w:rPr>
-                  <w:lastRenderedPageBreak/>
-                  <w:t>beírásához kattintson vagy koppintson ide.</w:t>
+                  <w:t>Szöveg beírásához kattintson vagy koppintson ide.</w:t>
                 </w:r>
               </w:p>
             </w:tc>
@@ -3950,16 +3936,7 @@
                     <w:sz w:val="18"/>
                     <w:szCs w:val="18"/>
                   </w:rPr>
-                  <w:t xml:space="preserve">A Fejlesztési- és felhasználói dokumentáció nem felel meg a követelményeknek. </w:t>
-                </w:r>
-                <w:r>
-                  <w:rPr>
-                    <w:rStyle w:val="Helyrzszveg"/>
-                    <w:sz w:val="18"/>
-                    <w:szCs w:val="18"/>
-                  </w:rPr>
-                  <w:lastRenderedPageBreak/>
-                  <w:t>beírásához kattintson vagy koppintson ide.</w:t>
+                  <w:t>Szöveg beírásához kattintson vagy koppintson ide.</w:t>
                 </w:r>
               </w:p>
             </w:tc>
@@ -3999,16 +3976,7 @@
                     <w:sz w:val="18"/>
                     <w:szCs w:val="18"/>
                   </w:rPr>
-                  <w:t xml:space="preserve">A Fejlesztési- és felhasználói dokumentáció elnagyolt, hiányos, szerkezete logikátlan.</w:t>
-                </w:r>
-                <w:r>
-                  <w:rPr>
-                    <w:rStyle w:val="Helyrzszveg"/>
-                    <w:sz w:val="18"/>
-                    <w:szCs w:val="18"/>
-                  </w:rPr>
-                  <w:lastRenderedPageBreak/>
-                  <w:t>kattintson vagy koppintson ide.</w:t>
+                  <w:t>Szöveg beírásához kattintson vagy koppintson ide.</w:t>
                 </w:r>
               </w:p>
             </w:tc>
@@ -4048,16 +4016,7 @@
                     <w:sz w:val="18"/>
                     <w:szCs w:val="18"/>
                   </w:rPr>
-                  <w:t xml:space="preserve">A Fejlesztési- és felhasználói dokumentáció tartalmazza a fontosabb fejezeteket, szerkezete logikus, a fejezetek közötti kohézió jó.</w:t>
-                </w:r>
-                <w:r>
-                  <w:rPr>
-                    <w:rStyle w:val="Helyrzszveg"/>
-                    <w:sz w:val="18"/>
-                    <w:szCs w:val="18"/>
-                  </w:rPr>
-                  <w:lastRenderedPageBreak/>
-                  <w:t>kattintson vagy koppintson ide.</w:t>
+                  <w:t>Szöveg beírásához kattintson vagy koppintson ide.</w:t>
                 </w:r>
               </w:p>
             </w:tc>
@@ -4097,16 +4056,7 @@
                     <w:sz w:val="18"/>
                     <w:szCs w:val="18"/>
                   </w:rPr>
-                  <w:t xml:space="preserve">A Fejlesztési- és felhasználói dokumentáció kiváló színvonalú, a dokumentálási szabályoknak teljes mértékben megfelel.</w:t>
-                </w:r>
-                <w:r>
-                  <w:rPr>
-                    <w:rStyle w:val="Helyrzszveg"/>
-                    <w:sz w:val="18"/>
-                    <w:szCs w:val="18"/>
-                  </w:rPr>
-                  <w:lastRenderedPageBreak/>
-                  <w:t>kattintson vagy koppintson ide.</w:t>
+                  <w:t>Szöveg beírásához kattintson vagy koppintson ide.</w:t>
                 </w:r>
               </w:p>
             </w:tc>
@@ -4135,11 +4085,13 @@
                   <w:bottom w:val="single" w:color="000000" w:sz="4" w:space="0"/>
                   <w:right w:val="single" w:color="000000" w:sz="4" w:space="0"/>
                 </w:tcBorders>
+                <w:vAlign w:val="center"/>
               </w:tcPr>
               <w:p>
                 <w:pPr>
                   <w:widowControl w:val="0"/>
                   <w:spacing w:after="0" w:line="240" w:lineRule="auto"/>
+                  <w:jc w:val="center"/>
                   <w:rPr>
                     <w:rFonts w:ascii="Times New Roman" w:hAnsi="Times New Roman" w:cs="Times New Roman"/>
                   </w:rPr>
@@ -4148,14 +4100,7 @@
                   <w:rPr>
                     <w:rStyle w:val="Helyrzszveg"/>
                   </w:rPr>
-                  <w:t xml:space="preserve">0</w:t>
-                </w:r>
-                <w:r>
-                  <w:rPr>
-                    <w:rStyle w:val="Helyrzszveg"/>
-                  </w:rPr>
-                  <w:lastRenderedPageBreak/>
-                  <w:t>beírásához kattintson vagy koppintson ide.</w:t>
+                  <w:t>Szöveg beírásához kattintson vagy koppintson ide.</w:t>
                 </w:r>
               </w:p>
             </w:tc>
@@ -4170,7 +4115,6 @@
           <w:sz w:val="18"/>
           <w:szCs w:val="18"/>
         </w:rPr>
-        <w:lastRenderedPageBreak/>
         <w:t xml:space="preserve">Rövid indoklás (opcionális): </w:t>
       </w:r>
       <w:sdt>
@@ -4193,7 +4137,7 @@
             <w:rPr>
               <w:rStyle w:val="Helyrzszveg"/>
             </w:rPr>
-            <w:t/>
+            <w:t>Szöveg beírásához kattintson vagy koppintson ide.</w:t>
           </w:r>
         </w:sdtContent>
       </w:sdt>
@@ -4492,7 +4436,7 @@
                     <w:sz w:val="18"/>
                     <w:szCs w:val="18"/>
                   </w:rPr>
-                  <w:t>8. Megvalósítás minősége IV.Tesztelés, futtatás.</w:t>
+                  <w:t>Szöveg beírásához kattintson vagy koppintson ide.</w:t>
                 </w:r>
               </w:sdtContent>
             </w:sdt>
@@ -4530,7 +4474,7 @@
                     <w:sz w:val="18"/>
                     <w:szCs w:val="18"/>
                   </w:rPr>
-                  <w:t>A dolgozat nem tartalmaz teszteléshez köthető részeket. A szoftver nem futtatható és/vagy nem a terveknek megfelelően működik.</w:t>
+                  <w:t>Szöveg beírásához kattintson vagy koppintson ide.</w:t>
                 </w:r>
               </w:p>
             </w:tc>
@@ -4568,7 +4512,7 @@
                     <w:sz w:val="18"/>
                     <w:szCs w:val="18"/>
                   </w:rPr>
-                  <w:t>A dolgozatban megjelennek a teszteléssel kapcsolatos törekvések, de elnagyoltak, hiányosak.</w:t>
+                  <w:t>Szöveg beírásához kattintson vagy koppintson ide.</w:t>
                 </w:r>
               </w:p>
             </w:tc>
@@ -4608,7 +4552,7 @@
                     <w:sz w:val="18"/>
                     <w:szCs w:val="18"/>
                   </w:rPr>
-                  <w:t>Jó színvonalú, de nem teljes körű tesztelés.</w:t>
+                  <w:t>Szöveg beírásához kattintson vagy koppintson ide.</w:t>
                 </w:r>
               </w:p>
             </w:tc>
@@ -4646,7 +4590,7 @@
                     <w:sz w:val="18"/>
                     <w:szCs w:val="18"/>
                   </w:rPr>
-                  <w:t>Teljes körű és jól dokumentált validáció és verifikáció (formális módszerek, tesztelési terv, tesztelési jegyzőkönyv és jelentés).</w:t>
+                  <w:t>Szöveg beírásához kattintson vagy koppintson ide.</w:t>
                 </w:r>
               </w:p>
             </w:tc>
@@ -4675,11 +4619,13 @@
                   <w:bottom w:val="single" w:color="000000" w:sz="4" w:space="0"/>
                   <w:right w:val="single" w:color="000000" w:sz="4" w:space="0"/>
                 </w:tcBorders>
+                <w:vAlign w:val="center"/>
               </w:tcPr>
               <w:p>
                 <w:pPr>
                   <w:widowControl w:val="0"/>
                   <w:spacing w:after="0" w:line="240" w:lineRule="auto"/>
+                  <w:jc w:val="center"/>
                   <w:rPr>
                     <w:rFonts w:ascii="Times New Roman" w:hAnsi="Times New Roman" w:cs="Times New Roman"/>
                   </w:rPr>
@@ -4688,7 +4634,7 @@
                   <w:rPr>
                     <w:rStyle w:val="Helyrzszveg"/>
                   </w:rPr>
-                  <w:t>0</w:t>
+                  <w:t>Szöveg beírásához kattintson vagy koppintson ide.</w:t>
                 </w:r>
               </w:p>
             </w:tc>
@@ -4733,7 +4679,7 @@
             <w:rPr>
               <w:rStyle w:val="Helyrzszveg"/>
             </w:rPr>
-            <w:t/>
+            <w:t>Szöveg beírásához kattintson vagy koppintson ide.</w:t>
           </w:r>
         </w:sdtContent>
       </w:sdt>
@@ -5033,7 +4979,7 @@
                     <w:sz w:val="18"/>
                     <w:szCs w:val="18"/>
                   </w:rPr>
-                  <w:t>9. A szakdolgozat összefoglalása.</w:t>
+                  <w:t>Szöveg beírásához kattintson vagy koppintson ide.</w:t>
                 </w:r>
               </w:p>
             </w:tc>
@@ -5071,7 +5017,7 @@
                     <w:sz w:val="18"/>
                     <w:szCs w:val="18"/>
                   </w:rPr>
-                  <w:t>Zavaros, leíró összefoglalás, tézisek nélkül.</w:t>
+                  <w:t>Szöveg beírásához kattintson vagy koppintson ide.</w:t>
                 </w:r>
               </w:p>
             </w:tc>
@@ -5109,7 +5055,7 @@
                     <w:sz w:val="18"/>
                     <w:szCs w:val="18"/>
                   </w:rPr>
-                  <w:t>Leíró jellegű összefoglalás, elnagyolt.</w:t>
+                  <w:t>Szöveg beírásához kattintson vagy koppintson ide.</w:t>
                 </w:r>
               </w:p>
             </w:tc>
@@ -5147,7 +5093,7 @@
                     <w:sz w:val="18"/>
                     <w:szCs w:val="18"/>
                   </w:rPr>
-                  <w:t>Világos tagolt összefoglalás, korrekt.</w:t>
+                  <w:t>Szöveg beírásához kattintson vagy koppintson ide.</w:t>
                 </w:r>
               </w:p>
             </w:tc>
@@ -5185,7 +5131,7 @@
                     <w:sz w:val="18"/>
                     <w:szCs w:val="18"/>
                   </w:rPr>
-                  <w:t>Kifogástalan, lényegre törő, továbbtervező.</w:t>
+                  <w:t>Szöveg beírásához kattintson vagy koppintson ide.</w:t>
                 </w:r>
               </w:p>
             </w:tc>
@@ -5216,11 +5162,13 @@
                   <w:bottom w:val="single" w:color="000000" w:sz="4" w:space="0"/>
                   <w:right w:val="single" w:color="000000" w:sz="4" w:space="0"/>
                 </w:tcBorders>
+                <w:vAlign w:val="center"/>
               </w:tcPr>
               <w:p>
                 <w:pPr>
                   <w:widowControl w:val="0"/>
                   <w:spacing w:after="0" w:line="240" w:lineRule="auto"/>
+                  <w:jc w:val="center"/>
                   <w:rPr>
                     <w:rFonts w:ascii="Times New Roman" w:hAnsi="Times New Roman" w:cs="Times New Roman"/>
                     <w:sz w:val="18"/>
@@ -5231,7 +5179,7 @@
                   <w:rPr>
                     <w:rStyle w:val="Helyrzszveg"/>
                   </w:rPr>
-                  <w:t>0</w:t>
+                  <w:t>Szöveg beírásához kattintson vagy koppintson ide.</w:t>
                 </w:r>
               </w:p>
             </w:tc>
@@ -5276,7 +5224,7 @@
             <w:rPr>
               <w:rStyle w:val="Helyrzszveg"/>
             </w:rPr>
-            <w:t/>
+            <w:t>Szöveg beírásához kattintson vagy koppintson ide.</w:t>
           </w:r>
         </w:sdtContent>
       </w:sdt>
@@ -5606,7 +5554,7 @@
                     <w:sz w:val="18"/>
                     <w:szCs w:val="18"/>
                   </w:rPr>
-                  <w:t>10. Összbenyomás, konzulens/opponens véleménye</w:t>
+                  <w:t>Szöveg beírásához kattintson vagy koppintson ide.</w:t>
                 </w:r>
               </w:p>
             </w:tc>
@@ -5650,7 +5598,7 @@
                     <w:sz w:val="18"/>
                     <w:szCs w:val="18"/>
                   </w:rPr>
-                  <w:t>A dolgozat szakmailag nem releváns, tartalmi formai követelményeknek nem felel meg.</w:t>
+                  <w:t>Szöveg beírásához kattintson vagy koppintson ide.</w:t>
                 </w:r>
               </w:p>
             </w:tc>
@@ -5694,7 +5642,7 @@
                     <w:sz w:val="18"/>
                     <w:szCs w:val="18"/>
                   </w:rPr>
-                  <w:t>A dolgozat szakmailag kevésbé releváns, tartalmi formai követelményeknek megfelel.</w:t>
+                  <w:t>Szöveg beírásához kattintson vagy koppintson ide.</w:t>
                 </w:r>
               </w:p>
             </w:tc>
@@ -5738,7 +5686,7 @@
                     <w:sz w:val="18"/>
                     <w:szCs w:val="18"/>
                   </w:rPr>
-                  <w:t>A dolgozat korrekt szakmai és módszertani felkészültséget tükröz.</w:t>
+                  <w:t>Szöveg beírásához kattintson vagy koppintson ide.</w:t>
                 </w:r>
               </w:p>
             </w:tc>
@@ -5782,7 +5730,7 @@
                     <w:sz w:val="18"/>
                     <w:szCs w:val="18"/>
                   </w:rPr>
-                  <w:t>A dolgozat kiváló szakmai felkészültséget tükröz.</w:t>
+                  <w:t>Szöveg beírásához kattintson vagy koppintson ide.</w:t>
                 </w:r>
               </w:p>
             </w:tc>
@@ -5812,11 +5760,13 @@
                   <w:bottom w:val="single" w:color="000000" w:sz="4" w:space="0"/>
                   <w:right w:val="single" w:color="000000" w:sz="4" w:space="0"/>
                 </w:tcBorders>
+                <w:vAlign w:val="center"/>
               </w:tcPr>
               <w:p>
                 <w:pPr>
                   <w:widowControl w:val="0"/>
                   <w:spacing w:after="0" w:line="240" w:lineRule="auto"/>
+                  <w:jc w:val="center"/>
                   <w:rPr>
                     <w:rFonts w:ascii="Times New Roman" w:hAnsi="Times New Roman" w:cs="Times New Roman"/>
                     <w:color w:val="000000"/>
@@ -5826,7 +5776,7 @@
                   <w:rPr>
                     <w:rStyle w:val="Helyrzszveg"/>
                   </w:rPr>
-                  <w:t>0</w:t>
+                  <w:t>Szöveg beírásához kattintson vagy koppintson ide.</w:t>
                 </w:r>
               </w:p>
             </w:tc>
@@ -5847,6 +5797,7 @@
           <w:sz w:val="18"/>
           <w:szCs w:val="18"/>
         </w:rPr>
+        <w:lastRenderedPageBreak/>
         <w:t>Rövid indoklás (opcionális):</w:t>
       </w:r>
       <w:r>
@@ -5879,7 +5830,7 @@
             <w:rPr>
               <w:rStyle w:val="Helyrzszveg"/>
             </w:rPr>
-            <w:t/>
+            <w:t>Szöveg beírásához kattintson vagy koppintson ide.</w:t>
           </w:r>
         </w:sdtContent>
       </w:sdt>
@@ -5935,7 +5886,6 @@
                 <w:rFonts w:ascii="Times New Roman" w:hAnsi="Times New Roman" w:cs="Times New Roman"/>
                 <w:b/>
               </w:rPr>
-              <w:lastRenderedPageBreak/>
               <w:t>Összes pontszám:</w:t>
             </w:r>
           </w:p>
@@ -6024,7 +5974,7 @@
             <w:rPr>
               <w:rStyle w:val="Helyrzszveg"/>
             </w:rPr>
-            <w:t/>
+            <w:t>string</w:t>
           </w:r>
         </w:p>
       </w:sdtContent>
@@ -6087,7 +6037,7 @@
             <w:rPr>
               <w:rStyle w:val="Helyrzszveg"/>
             </w:rPr>
-            <w:t>Elégtelen (1)</w:t>
+            <w:t>string</w:t>
           </w:r>
         </w:sdtContent>
       </w:sdt>
@@ -6306,7 +6256,7 @@
             <w:rPr>
               <w:rStyle w:val="Helyrzszveg"/>
             </w:rPr>
-            <w:t/>
+            <w:t>string</w:t>
           </w:r>
         </w:p>
       </w:sdtContent>
@@ -6368,8 +6318,7 @@
             <w:rPr>
               <w:rStyle w:val="Helyrzszveg"/>
             </w:rPr>
-            <w:t>1. sadas
-2. sadasd</w:t>
+            <w:t>1. string</w:t>
           </w:r>
         </w:p>
       </w:sdtContent>
@@ -7751,12 +7700,22 @@
   </w:compat>
   <w:rsids>
     <w:rsidRoot w:val="00C83DE2"/>
+    <w:rsid w:val="000210FB"/>
     <w:rsid w:val="00065923"/>
     <w:rsid w:val="001D3AB5"/>
     <w:rsid w:val="00345868"/>
+    <w:rsid w:val="005F43D1"/>
+    <w:rsid w:val="0078442C"/>
+    <w:rsid w:val="00926C40"/>
+    <w:rsid w:val="00B77364"/>
+    <w:rsid w:val="00BF0374"/>
+    <w:rsid w:val="00BF5493"/>
     <w:rsid w:val="00C637EF"/>
     <w:rsid w:val="00C70B75"/>
+    <w:rsid w:val="00C82E2C"/>
     <w:rsid w:val="00C83DE2"/>
+    <w:rsid w:val="00DB107A"/>
+    <w:rsid w:val="00E90A4E"/>
   </w:rsids>
   <m:mathPr>
     <m:mathFont m:val="Cambria Math"/>

</xml_diff>